<commit_message>
fix(docx): harden flow caps pagination and geometry warnings
</commit_message>
<xml_diff>
--- a/testdata/docx/images.docx
+++ b/testdata/docx/images.docx
@@ -35,6 +35,36 @@
               </a:graphicData>
             </a:graphic>
           </wp:anchor>
+        </w:drawing>
+      </w:r>
+    </w:p>
+    <w:p>
+      <w:r>
+        <w:drawing>
+          <wp:inline xmlns:wp="http://schemas.openxmlformats.org/drawingml/2006/wordprocessingDrawing">
+            <wp:extent cx="635000" cy="635000"/>
+            <wp:docPr id="3" name="Missing" descr="Missing alt"/>
+            <a:graphic xmlns:a="http://schemas.openxmlformats.org/drawingml/2006/main">
+              <a:graphicData>
+                <a:blip r:embed="rMissing"/>
+              </a:graphicData>
+            </a:graphic>
+          </wp:inline>
+        </w:drawing>
+      </w:r>
+    </w:p>
+    <w:p>
+      <w:r>
+        <w:drawing>
+          <wp:inline xmlns:wp="http://schemas.openxmlformats.org/drawingml/2006/wordprocessingDrawing">
+            <wp:extent cx="635000" cy="635000"/>
+            <wp:docPr id="4" name="External"/>
+            <a:graphic xmlns:a="http://schemas.openxmlformats.org/drawingml/2006/main">
+              <a:graphicData>
+                <a:blip r:embed="rExternal"/>
+              </a:graphicData>
+            </a:graphic>
+          </wp:inline>
         </w:drawing>
       </w:r>
     </w:p>

</xml_diff>

<commit_message>
fix(docx): preserve wrapped content and body pagination
</commit_message>
<xml_diff>
--- a/testdata/docx/images.docx
+++ b/testdata/docx/images.docx
@@ -66,6 +66,15 @@
             </a:graphic>
           </wp:inline>
         </w:drawing>
+      </w:r>
+    </w:p>
+    <w:p>
+      <w:r>
+        <w:t>Office art policy</w:t>
+        <w:pict>
+          <v:rect style="width:72pt;height:1pt"/>
+        </w:pict>
+        <w:drawing/>
       </w:r>
     </w:p>
     <w:sectPr>

</xml_diff>